<commit_message>
Safety Alert: rewrite the thank-you note and add the reporter's email
New wording per Tony: thanks the reporter for bringing the issue to
attention and invites the reader to contact them directly, rather than
the old "helped us take action" framing. Uses "them" rather than a fixed
pronoun since the reporter varies per alert.

The email is read from Own It's own Staff/User tables (matched by name)
rather than guessed from Teammate's undocumented employee shape. It's its
own run in the template so a missing email drops the whole "You can reach
them at..." sentence cleanly instead of leaving "at ." dangling.

Also shrank the thank-you box's font from 7.5pt to 6.5pt (sz 15->13) —
the longer wording plus an email overflowed the box's fixed (noAutofit)
size at the original font; verified against several real name/email
lengths that it now fits without clipping.

Co-Authored-By: Claude Sonnet 5 <noreply@anthropic.com>
</commit_message>
<xml_diff>
--- a/server/src/assets/safety-alert-template.docx
+++ b/server/src/assets/safety-alert-template.docx
@@ -1015,16 +1015,16 @@
                                 <w:p>
                                   <w:pPr>
                                     <w:rPr>
-                                      <w:sz w:val="15"/>
-                                      <w:szCs w:val="15"/>
+                                      <w:sz w:val="13"/>
+                                      <w:szCs w:val="13"/>
                                     </w:rPr>
                                   </w:pPr>
                                   <w:r>
                                     <w:rPr>
                                       <w:rFonts w:ascii="Arial" w:hAnsi="Arial" w:cs="Arial"/>
                                       <w:color w:val="000000"/>
-                                      <w:sz w:val="15"/>
-                                      <w:szCs w:val="15"/>
+                                      <w:sz w:val="13"/>
+                                      <w:szCs w:val="13"/>
                                     </w:rPr>
                                     <w:t>T</w:t>
                                   </w:r>
@@ -1032,8 +1032,8 @@
                                     <w:rPr>
                                       <w:rFonts w:ascii="Arial" w:hAnsi="Arial" w:cs="Arial"/>
                                       <w:color w:val="000000"/>
-                                      <w:sz w:val="15"/>
-                                      <w:szCs w:val="15"/>
+                                      <w:sz w:val="13"/>
+                                      <w:szCs w:val="13"/>
                                     </w:rPr>
                                     <w:t>hank you</w:t>
                                   </w:r>
@@ -1041,8 +1041,8 @@
                                     <w:rPr>
                                       <w:rFonts w:ascii="Arial" w:hAnsi="Arial" w:cs="Arial"/>
                                       <w:color w:val="000000"/>
-                                      <w:sz w:val="15"/>
-                                      <w:szCs w:val="15"/>
+                                      <w:sz w:val="13"/>
+                                      <w:szCs w:val="13"/>
                                     </w:rPr>
                                     <w:t xml:space="preserve"> </w:t>
                                   </w:r>
@@ -1050,8 +1050,8 @@
                                     <w:rPr>
                                       <w:rFonts w:ascii="Arial" w:hAnsi="Arial" w:cs="Arial"/>
                                       <w:color w:val="000000"/>
-                                      <w:sz w:val="15"/>
-                                      <w:szCs w:val="15"/>
+                                      <w:sz w:val="13"/>
+                                      <w:szCs w:val="13"/>
                                     </w:rPr>
                                     <w:t>to</w:t>
                                   </w:r>
@@ -1060,8 +1060,8 @@
                                       <w:rStyle w:val="apple-converted-space"/>
                                       <w:rFonts w:ascii="Arial" w:eastAsiaTheme="majorEastAsia" w:hAnsi="Arial" w:cs="Arial"/>
                                       <w:color w:val="000000"/>
-                                      <w:sz w:val="15"/>
-                                      <w:szCs w:val="15"/>
+                                      <w:sz w:val="13"/>
+                                      <w:szCs w:val="13"/>
                                     </w:rPr>
                                     <w:t> </w:t>
                                   </w:r>
@@ -1070,8 +1070,8 @@
                                       <w:rStyle w:val="Strong"/>
                                       <w:rFonts w:ascii="Arial" w:eastAsiaTheme="majorEastAsia" w:hAnsi="Arial" w:cs="Arial"/>
                                       <w:color w:val="000000"/>
-                                      <w:sz w:val="15"/>
-                                      <w:szCs w:val="15"/>
+                                      <w:sz w:val="13"/>
+                                      <w:szCs w:val="13"/>
                                     </w:rPr>
                                     <w:t xml:space="preserve">[Name]</w:t>
                                   </w:r>
@@ -1080,8 +1080,8 @@
                                       <w:rStyle w:val="Strong"/>
                                       <w:rFonts w:ascii="Arial" w:eastAsiaTheme="majorEastAsia" w:hAnsi="Arial" w:cs="Arial"/>
                                       <w:color w:val="000000"/>
-                                      <w:sz w:val="15"/>
-                                      <w:szCs w:val="15"/>
+                                      <w:sz w:val="13"/>
+                                      <w:szCs w:val="13"/>
                                     </w:rPr>
                                     <w:t xml:space="preserve"> </w:t>
                                   </w:r>
@@ -1089,10 +1089,19 @@
                                     <w:rPr>
                                       <w:rFonts w:ascii="Arial" w:hAnsi="Arial" w:cs="Arial"/>
                                       <w:color w:val="000000"/>
-                                      <w:sz w:val="15"/>
-                                      <w:szCs w:val="15"/>
+                                      <w:sz w:val="13"/>
+                                      <w:szCs w:val="13"/>
                                     </w:rPr>
-                                    <w:t xml:space="preserve">for their contribution to keeping us safe. By reporting this issue, they helped us take action before it could turn into something more serious.</w:t>
+                                    <w:t xml:space="preserve">for bringing this issue to our attention. If you'd like more information or clarification on anything covered here, please get in touch with them directly.</w:t>
+                                  </w:r>
+                                  <w:r>
+                                    <w:rPr>
+                                      <w:rFonts w:ascii="Arial" w:hAnsi="Arial" w:cs="Arial"/>
+                                      <w:color w:val="000000"/>
+                                      <w:sz w:val="13"/>
+                                      <w:szCs w:val="13"/>
+                                    </w:rPr>
+                                    <w:t xml:space="preserve"> You can reach them at [Email].</w:t>
                                   </w:r>
                                 </w:p>
                               </w:txbxContent>

</xml_diff>

<commit_message>
Safety Alert: remove headshot's border, align its box with the thank-you box
The HEADSHOT frame was the only one of the four photo frames with a
drawn border (0.75pt black) — PHOTO 1/2/3 never had one. Set to noFill
to match, per Tony's ask to drop the outline on the photo boxes.

Also fixed a real, measurable misalignment Tony spotted from a
screenshot: the headshot box's bottom already matched the thank-you
text box beside it exactly, but its top sat 12700 EMU (1pt) lower —
so the two boxes were very slightly different heights. Raised the top
and grew the height by that same 12700 EMU; verified in the exported
PDF that both boxes now share the identical top and bottom edge
(624.05pt / 737.80pt).

Co-Authored-By: Claude Sonnet 5 <noreply@anthropic.com>
</commit_message>
<xml_diff>
--- a/server/src/assets/safety-alert-template.docx
+++ b/server/src/assets/safety-alert-template.docx
@@ -1134,9 +1134,9 @@
                     <wp:posOffset>1068070</wp:posOffset>
                   </wp:positionH>
                   <wp:positionV relativeFrom="margin">
-                    <wp:posOffset>5111115</wp:posOffset>
+                    <wp:posOffset>5098415</wp:posOffset>
                   </wp:positionV>
-                  <wp:extent cx="1013460" cy="1431925"/>
+                  <wp:extent cx="1013460" cy="1444625"/>
                   <wp:effectExtent l="12700" t="12700" r="15240" b="15875"/>
                   <wp:wrapSquare wrapText="bothSides"/>
                   <wp:docPr id="1581491044" name="Picture 6"/>
@@ -1166,34 +1166,13 @@
                         <pic:spPr bwMode="auto">
                           <a:xfrm>
                             <a:off x="0" y="0"/>
-                            <a:ext cx="1013460" cy="1431925"/>
+                            <a:ext cx="1013460" cy="1444625"/>
                           </a:xfrm>
                           <a:prstGeom prst="rect">
                             <a:avLst/>
                           </a:prstGeom>
-                          <a:ln w="9525" cap="flat" cmpd="sng" algn="ctr">
-                            <a:solidFill>
-                              <a:prstClr val="black"/>
-                            </a:solidFill>
-                            <a:prstDash val="solid"/>
-                            <a:round/>
-                            <a:headEnd type="none" w="med" len="med"/>
-                            <a:tailEnd type="none" w="med" len="med"/>
-                            <a:extLst>
-                              <a:ext uri="{C807C97D-BFC1-408E-A445-0C87EB9F89A2}">
-                                <ask:lineSketchStyleProps xmlns:ask="http://schemas.microsoft.com/office/drawing/2018/sketchyshapes" sd="0">
-                                  <a:custGeom>
-                                    <a:avLst/>
-                                    <a:gdLst/>
-                                    <a:ahLst/>
-                                    <a:cxnLst/>
-                                    <a:rect l="0" t="0" r="0" b="0"/>
-                                    <a:pathLst/>
-                                  </a:custGeom>
-                                  <ask:type/>
-                                </ask:lineSketchStyleProps>
-                              </a:ext>
-                            </a:extLst>
+                          <a:ln>
+                            <a:noFill/>
                           </a:ln>
                           <a:extLst>
                             <a:ext uri="{53640926-AAD7-44D8-BBD7-CCE9431645EC}">

</xml_diff>

<commit_message>
Safety Alert: close the overlapping gap between the 3 photo frames
Measured via exact PDF coordinates (not eyeballed, per Tony's ask to
look carefully): PHOTO 1/2/3 were overlapping each other by ~2.5pt
where they meet, not sitting flush — visible as an uneven seam between
panels. Shifted PHOTO 2 and PHOTO 3's position down to close each
overlap exactly, and aligned PHOTO 3's left edge to match 1 and 2 (it
had drifted 6023 EMU to the right). Position-only changes — cx/cy left
untouched so the crop-to-frame aspect ratio (and thus every photo's own
fit) is unaffected. Verified in the exported PDF: 0.000pt gap/overlap
between all three frames, left edges identical.

Co-Authored-By: Claude Sonnet 5 <noreply@anthropic.com>
</commit_message>
<xml_diff>
--- a/server/src/assets/safety-alert-template.docx
+++ b/server/src/assets/safety-alert-template.docx
@@ -904,7 +904,7 @@
                     <wp:posOffset>90170</wp:posOffset>
                   </wp:positionH>
                   <wp:positionV relativeFrom="margin">
-                    <wp:posOffset>1661160</wp:posOffset>
+                    <wp:posOffset>1693545</wp:posOffset>
                   </wp:positionV>
                   <wp:extent cx="2007870" cy="2106295"/>
                   <wp:effectExtent l="0" t="0" r="0" b="1905"/>
@@ -1201,10 +1201,10 @@
                 <wp:anchor distT="0" distB="0" distL="114300" distR="114300" simplePos="0" relativeHeight="251671549" behindDoc="0" locked="0" layoutInCell="1" allowOverlap="1" wp14:anchorId="1DD9392C" wp14:editId="615BEFD8">
                   <wp:simplePos x="0" y="0"/>
                   <wp:positionH relativeFrom="margin">
-                    <wp:posOffset>96193</wp:posOffset>
+                    <wp:posOffset>90170</wp:posOffset>
                   </wp:positionH>
                   <wp:positionV relativeFrom="margin">
-                    <wp:posOffset>3736258</wp:posOffset>
+                    <wp:posOffset>3799840</wp:posOffset>
                   </wp:positionV>
                   <wp:extent cx="1986280" cy="1369060"/>
                   <wp:effectExtent l="0" t="0" r="0" b="2540"/>

</xml_diff>

<commit_message>
Safety Alert: bold the email, drop the thank-you box's border
Split the single "You can reach them at [Email]." run into two — the
lead-in stays regular weight, "[Email]." (email + trailing period) is
now bold via the same Strong character style [Name] already uses.
Verified in the exported PDF: "reach them at " renders in ArialMT,
"tony@pipelines.nz." in Arial-BoldMT.

Also removed the Text Box's own 0.5pt black border, matching headshot
and the 3 photo frames (both already borderless) — the last piece of
Tony's border-removal ask, for a fully border-free group.

Co-Authored-By: Claude Sonnet 5 <noreply@anthropic.com>
</commit_message>
<xml_diff>
--- a/server/src/assets/safety-alert-template.docx
+++ b/server/src/assets/safety-alert-template.docx
@@ -1002,10 +1002,8 @@
                           <a:solidFill>
                             <a:schemeClr val="lt1"/>
                           </a:solidFill>
-                          <a:ln w="6350">
-                            <a:solidFill>
-                              <a:prstClr val="black"/>
-                            </a:solidFill>
+                          <a:ln>
+                            <a:noFill/>
                           </a:ln>
                         </wps:spPr>
                         <wps:txbx>
@@ -1099,7 +1097,17 @@
                                   <w:sz w:val="13"/>
                                   <w:szCs w:val="13"/>
                                 </w:rPr>
-                                <w:t xml:space="preserve"> You can reach them at [Email].</w:t>
+                                <w:t xml:space="preserve"> You can reach them at </w:t>
+                              </w:r>
+                              <w:r>
+                                <w:rPr>
+                                  <w:rStyle w:val="Strong"/>
+                                  <w:rFonts w:ascii="Arial" w:eastAsiaTheme="majorEastAsia" w:hAnsi="Arial" w:cs="Arial"/>
+                                  <w:color w:val="000000"/>
+                                  <w:sz w:val="13"/>
+                                  <w:szCs w:val="13"/>
+                                </w:rPr>
+                                <w:t xml:space="preserve">[Email].</w:t>
                               </w:r>
                             </w:p>
                           </w:txbxContent>

</xml_diff>